<commit_message>
Remove obsolete docs; add lower mechanism report
Clean up repository by deleting multiple outdated General/ files. Add a new Robot Mechanism (Lower) Detailed Report.docx to consolidate and replace legacy documentation.
</commit_message>
<xml_diff>
--- a/General/General Product/Rotational Drive System.docx
+++ b/General/General Product/Rotational Drive System.docx
@@ -265,15 +265,7 @@
         <w:t>T</w:t>
       </w:r>
       <w:r>
-        <w:t xml:space="preserve">he yaw axis may be approximated as the geometric centreline of the main robot body, such as the central axis of the 8080 aluminium extrusion </w:t>
-      </w:r>
-      <w:proofErr w:type="gramStart"/>
-      <w:r>
-        <w:t>frame</w:t>
-      </w:r>
-      <w:proofErr w:type="gramEnd"/>
-      <w:r>
-        <w:t xml:space="preserve"> housed within the steel tube</w:t>
+        <w:t>he yaw axis may be approximated as the geometric centreline of the main robot body, such as the central axis of the 8080 aluminium extrusion frame housed within the steel tube</w:t>
       </w:r>
       <w:r>
         <w:t xml:space="preserve">, </w:t>
@@ -299,7 +291,15 @@
         <w:t>centre of rotation</w:t>
       </w:r>
       <w:r>
-        <w:t>, it being where the striking force comes in contact with the padding</w:t>
+        <w:t xml:space="preserve">, it being where the striking force </w:t>
+      </w:r>
+      <w:proofErr w:type="gramStart"/>
+      <w:r>
+        <w:t>comes in contact with</w:t>
+      </w:r>
+      <w:proofErr w:type="gramEnd"/>
+      <w:r>
+        <w:t xml:space="preserve"> the padding</w:t>
       </w:r>
       <w:r>
         <w:t>. Thus, for final validation:</w:t>
@@ -1064,19 +1064,7 @@
             <w:rPr>
               <w:rFonts w:ascii="Cambria Math" w:hAnsi="Cambria Math"/>
             </w:rPr>
-            <m:t>J=0.5</m:t>
-          </m:r>
-          <m:r>
-            <w:rPr>
-              <w:rFonts w:ascii="Cambria Math" w:hAnsi="Cambria Math"/>
-            </w:rPr>
-            <m:t>77</m:t>
-          </m:r>
-          <m:r>
-            <w:rPr>
-              <w:rFonts w:ascii="Cambria Math" w:hAnsi="Cambria Math"/>
-            </w:rPr>
-            <m:t xml:space="preserve"> kg⋅</m:t>
+            <m:t>J=0.577 kg⋅</m:t>
           </m:r>
           <m:sSup>
             <m:sSupPr>
@@ -1146,19 +1134,7 @@
             <w:rPr>
               <w:rFonts w:ascii="Cambria Math" w:hAnsi="Cambria Math"/>
             </w:rPr>
-            <m:t>=α×J=2.618×0.5</m:t>
-          </m:r>
-          <m:r>
-            <w:rPr>
-              <w:rFonts w:ascii="Cambria Math" w:hAnsi="Cambria Math"/>
-            </w:rPr>
-            <m:t>77</m:t>
-          </m:r>
-          <m:r>
-            <w:rPr>
-              <w:rFonts w:ascii="Cambria Math" w:hAnsi="Cambria Math"/>
-            </w:rPr>
-            <m:t>=</m:t>
+            <m:t>=α×J=2.618×0.577=</m:t>
           </m:r>
           <m:r>
             <m:rPr>
@@ -1167,25 +1143,7 @@
             <w:rPr>
               <w:rFonts w:ascii="Cambria Math" w:hAnsi="Cambria Math"/>
             </w:rPr>
-            <m:t>1.</m:t>
-          </m:r>
-          <m:r>
-            <m:rPr>
-              <m:sty m:val="bi"/>
-            </m:rPr>
-            <w:rPr>
-              <w:rFonts w:ascii="Cambria Math" w:hAnsi="Cambria Math"/>
-            </w:rPr>
-            <m:t>51</m:t>
-          </m:r>
-          <m:r>
-            <m:rPr>
-              <m:sty m:val="bi"/>
-            </m:rPr>
-            <w:rPr>
-              <w:rFonts w:ascii="Cambria Math" w:hAnsi="Cambria Math"/>
-            </w:rPr>
-            <m:t xml:space="preserve"> N⋅m</m:t>
+            <m:t>1.51 N⋅m</m:t>
           </m:r>
         </m:oMath>
       </m:oMathPara>
@@ -2257,6 +2215,9 @@
       </w:r>
     </w:p>
     <w:p>
+      <w:pPr>
+        <w:jc w:val="left"/>
+      </w:pPr>
       <w:r>
         <w:t>[</w:t>
       </w:r>
@@ -2447,45 +2408,35 @@
     </w:p>
     <w:tbl>
       <w:tblPr>
+        <w:tblStyle w:val="GridTable5Dark"/>
         <w:tblW w:w="0" w:type="auto"/>
-        <w:tblCellSpacing w:w="15" w:type="dxa"/>
-        <w:tblCellMar>
-          <w:top w:w="15" w:type="dxa"/>
-          <w:left w:w="15" w:type="dxa"/>
-          <w:bottom w:w="15" w:type="dxa"/>
-          <w:right w:w="15" w:type="dxa"/>
-        </w:tblCellMar>
-        <w:tblLook w:val="04A0" w:firstRow="1" w:lastRow="0" w:firstColumn="1" w:lastColumn="0" w:noHBand="0" w:noVBand="1"/>
+        <w:tblLook w:val="06A0" w:firstRow="1" w:lastRow="0" w:firstColumn="1" w:lastColumn="0" w:noHBand="1" w:noVBand="1"/>
       </w:tblPr>
       <w:tblGrid>
-        <w:gridCol w:w="2224"/>
-        <w:gridCol w:w="2708"/>
-        <w:gridCol w:w="1767"/>
-        <w:gridCol w:w="2751"/>
+        <w:gridCol w:w="2328"/>
+        <w:gridCol w:w="2563"/>
+        <w:gridCol w:w="1821"/>
+        <w:gridCol w:w="2638"/>
       </w:tblGrid>
       <w:tr>
         <w:trPr>
-          <w:tblHeader/>
-          <w:tblCellSpacing w:w="15" w:type="dxa"/>
+          <w:cnfStyle w:val="100000000000" w:firstRow="1" w:lastRow="0" w:firstColumn="0" w:lastColumn="0" w:oddVBand="0" w:evenVBand="0" w:oddHBand="0" w:evenHBand="0" w:firstRowFirstColumn="0" w:firstRowLastColumn="0" w:lastRowFirstColumn="0" w:lastRowLastColumn="0"/>
         </w:trPr>
         <w:tc>
           <w:tcPr>
+            <w:cnfStyle w:val="001000000000" w:firstRow="0" w:lastRow="0" w:firstColumn="1" w:lastColumn="0" w:oddVBand="0" w:evenVBand="0" w:oddHBand="0" w:evenHBand="0" w:firstRowFirstColumn="0" w:firstRowLastColumn="0" w:lastRowFirstColumn="0" w:lastRowLastColumn="0"/>
             <w:tcW w:w="0" w:type="auto"/>
-            <w:vAlign w:val="center"/>
             <w:hideMark/>
           </w:tcPr>
           <w:p>
             <w:pPr>
+              <w:jc w:val="left"/>
               <w:rPr>
-                <w:b/>
-                <w:bCs/>
+                <w:b w:val="0"/>
+                <w:bCs w:val="0"/>
               </w:rPr>
             </w:pPr>
             <w:r>
-              <w:rPr>
-                <w:b/>
-                <w:bCs/>
-              </w:rPr>
               <w:t>Torque component</w:t>
             </w:r>
           </w:p>
@@ -2493,21 +2444,18 @@
         <w:tc>
           <w:tcPr>
             <w:tcW w:w="0" w:type="auto"/>
-            <w:vAlign w:val="center"/>
             <w:hideMark/>
           </w:tcPr>
           <w:p>
             <w:pPr>
+              <w:jc w:val="left"/>
+              <w:cnfStyle w:val="100000000000" w:firstRow="1" w:lastRow="0" w:firstColumn="0" w:lastColumn="0" w:oddVBand="0" w:evenVBand="0" w:oddHBand="0" w:evenHBand="0" w:firstRowFirstColumn="0" w:firstRowLastColumn="0" w:lastRowFirstColumn="0" w:lastRowLastColumn="0"/>
               <w:rPr>
-                <w:b/>
-                <w:bCs/>
+                <w:b w:val="0"/>
+                <w:bCs w:val="0"/>
               </w:rPr>
             </w:pPr>
             <w:r>
-              <w:rPr>
-                <w:b/>
-                <w:bCs/>
-              </w:rPr>
               <w:t>Meaning</w:t>
             </w:r>
           </w:p>
@@ -2515,21 +2463,18 @@
         <w:tc>
           <w:tcPr>
             <w:tcW w:w="0" w:type="auto"/>
-            <w:vAlign w:val="center"/>
             <w:hideMark/>
           </w:tcPr>
           <w:p>
             <w:pPr>
+              <w:jc w:val="left"/>
+              <w:cnfStyle w:val="100000000000" w:firstRow="1" w:lastRow="0" w:firstColumn="0" w:lastColumn="0" w:oddVBand="0" w:evenVBand="0" w:oddHBand="0" w:evenHBand="0" w:firstRowFirstColumn="0" w:firstRowLastColumn="0" w:lastRowFirstColumn="0" w:lastRowLastColumn="0"/>
               <w:rPr>
-                <w:b/>
-                <w:bCs/>
+                <w:b w:val="0"/>
+                <w:bCs w:val="0"/>
               </w:rPr>
             </w:pPr>
             <w:r>
-              <w:rPr>
-                <w:b/>
-                <w:bCs/>
-              </w:rPr>
               <w:t>Current value / form</w:t>
             </w:r>
           </w:p>
@@ -2537,37 +2482,34 @@
         <w:tc>
           <w:tcPr>
             <w:tcW w:w="0" w:type="auto"/>
-            <w:vAlign w:val="center"/>
             <w:hideMark/>
           </w:tcPr>
           <w:p>
             <w:pPr>
+              <w:jc w:val="left"/>
+              <w:cnfStyle w:val="100000000000" w:firstRow="1" w:lastRow="0" w:firstColumn="0" w:lastColumn="0" w:oddVBand="0" w:evenVBand="0" w:oddHBand="0" w:evenHBand="0" w:firstRowFirstColumn="0" w:firstRowLastColumn="0" w:lastRowFirstColumn="0" w:lastRowLastColumn="0"/>
               <w:rPr>
-                <w:b/>
-                <w:bCs/>
+                <w:b w:val="0"/>
+                <w:bCs w:val="0"/>
               </w:rPr>
             </w:pPr>
             <w:r>
-              <w:rPr>
-                <w:b/>
-                <w:bCs/>
-              </w:rPr>
               <w:t>Design role</w:t>
             </w:r>
           </w:p>
         </w:tc>
       </w:tr>
       <w:tr>
-        <w:trPr>
-          <w:tblCellSpacing w:w="15" w:type="dxa"/>
-        </w:trPr>
         <w:tc>
           <w:tcPr>
+            <w:cnfStyle w:val="001000000000" w:firstRow="0" w:lastRow="0" w:firstColumn="1" w:lastColumn="0" w:oddVBand="0" w:evenVBand="0" w:oddHBand="0" w:evenHBand="0" w:firstRowFirstColumn="0" w:firstRowLastColumn="0" w:lastRowFirstColumn="0" w:lastRowLastColumn="0"/>
             <w:tcW w:w="0" w:type="auto"/>
-            <w:vAlign w:val="center"/>
             <w:hideMark/>
           </w:tcPr>
           <w:p>
+            <w:pPr>
+              <w:jc w:val="left"/>
+            </w:pPr>
             <w:r>
               <w:t>Acceleration / deceleration torque</w:t>
             </w:r>
@@ -2576,10 +2518,13 @@
         <w:tc>
           <w:tcPr>
             <w:tcW w:w="0" w:type="auto"/>
-            <w:vAlign w:val="center"/>
             <w:hideMark/>
           </w:tcPr>
           <w:p>
+            <w:pPr>
+              <w:jc w:val="left"/>
+              <w:cnfStyle w:val="000000000000" w:firstRow="0" w:lastRow="0" w:firstColumn="0" w:lastColumn="0" w:oddVBand="0" w:evenVBand="0" w:oddHBand="0" w:evenHBand="0" w:firstRowFirstColumn="0" w:firstRowLastColumn="0" w:lastRowFirstColumn="0" w:lastRowLastColumn="0"/>
+            </w:pPr>
             <w:r>
               <w:t>Torque to start and stop rotating mass</w:t>
             </w:r>
@@ -2588,10 +2533,13 @@
         <w:tc>
           <w:tcPr>
             <w:tcW w:w="0" w:type="auto"/>
-            <w:vAlign w:val="center"/>
             <w:hideMark/>
           </w:tcPr>
           <w:p>
+            <w:pPr>
+              <w:jc w:val="left"/>
+              <w:cnfStyle w:val="000000000000" w:firstRow="0" w:lastRow="0" w:firstColumn="0" w:lastColumn="0" w:oddVBand="0" w:evenVBand="0" w:oddHBand="0" w:evenHBand="0" w:firstRowFirstColumn="0" w:firstRowLastColumn="0" w:lastRowFirstColumn="0" w:lastRowLastColumn="0"/>
+            </w:pPr>
             <w:r>
               <w:rPr>
                 <w:b/>
@@ -2613,10 +2561,13 @@
         <w:tc>
           <w:tcPr>
             <w:tcW w:w="0" w:type="auto"/>
-            <w:vAlign w:val="center"/>
             <w:hideMark/>
           </w:tcPr>
           <w:p>
+            <w:pPr>
+              <w:jc w:val="left"/>
+              <w:cnfStyle w:val="000000000000" w:firstRow="0" w:lastRow="0" w:firstColumn="0" w:lastColumn="0" w:oddVBand="0" w:evenVBand="0" w:oddHBand="0" w:evenHBand="0" w:firstRowFirstColumn="0" w:firstRowLastColumn="0" w:lastRowFirstColumn="0" w:lastRowLastColumn="0"/>
+            </w:pPr>
             <w:r>
               <w:t>Transient motion requirement</w:t>
             </w:r>
@@ -2624,16 +2575,16 @@
         </w:tc>
       </w:tr>
       <w:tr>
-        <w:trPr>
-          <w:tblCellSpacing w:w="15" w:type="dxa"/>
-        </w:trPr>
         <w:tc>
           <w:tcPr>
+            <w:cnfStyle w:val="001000000000" w:firstRow="0" w:lastRow="0" w:firstColumn="1" w:lastColumn="0" w:oddVBand="0" w:evenVBand="0" w:oddHBand="0" w:evenHBand="0" w:firstRowFirstColumn="0" w:firstRowLastColumn="0" w:lastRowFirstColumn="0" w:lastRowLastColumn="0"/>
             <w:tcW w:w="0" w:type="auto"/>
-            <w:vAlign w:val="center"/>
             <w:hideMark/>
           </w:tcPr>
           <w:p>
+            <w:pPr>
+              <w:jc w:val="left"/>
+            </w:pPr>
             <w:r>
               <w:t>Holding / stall disturbance torque</w:t>
             </w:r>
@@ -2642,10 +2593,13 @@
         <w:tc>
           <w:tcPr>
             <w:tcW w:w="0" w:type="auto"/>
-            <w:vAlign w:val="center"/>
             <w:hideMark/>
           </w:tcPr>
           <w:p>
+            <w:pPr>
+              <w:jc w:val="left"/>
+              <w:cnfStyle w:val="000000000000" w:firstRow="0" w:lastRow="0" w:firstColumn="0" w:lastColumn="0" w:oddVBand="0" w:evenVBand="0" w:oddHBand="0" w:evenHBand="0" w:firstRowFirstColumn="0" w:firstRowLastColumn="0" w:lastRowFirstColumn="0" w:lastRowLastColumn="0"/>
+            </w:pPr>
             <w:r>
               <w:t>Torque to resist punch-induced moment</w:t>
             </w:r>
@@ -2654,10 +2608,13 @@
         <w:tc>
           <w:tcPr>
             <w:tcW w:w="0" w:type="auto"/>
-            <w:vAlign w:val="center"/>
             <w:hideMark/>
           </w:tcPr>
           <w:p>
+            <w:pPr>
+              <w:jc w:val="left"/>
+              <w:cnfStyle w:val="000000000000" w:firstRow="0" w:lastRow="0" w:firstColumn="0" w:lastColumn="0" w:oddVBand="0" w:evenVBand="0" w:oddHBand="0" w:evenHBand="0" w:firstRowFirstColumn="0" w:firstRowLastColumn="0" w:lastRowFirstColumn="0" w:lastRowLastColumn="0"/>
+            </w:pPr>
             <w:r>
               <w:rPr>
                 <w:b/>
@@ -2678,10 +2635,13 @@
         <w:tc>
           <w:tcPr>
             <w:tcW w:w="0" w:type="auto"/>
-            <w:vAlign w:val="center"/>
             <w:hideMark/>
           </w:tcPr>
           <w:p>
+            <w:pPr>
+              <w:jc w:val="left"/>
+              <w:cnfStyle w:val="000000000000" w:firstRow="0" w:lastRow="0" w:firstColumn="0" w:lastColumn="0" w:oddVBand="0" w:evenVBand="0" w:oddHBand="0" w:evenHBand="0" w:firstRowFirstColumn="0" w:firstRowLastColumn="0" w:lastRowFirstColumn="0" w:lastRowLastColumn="0"/>
+            </w:pPr>
             <w:r>
               <w:t>Peak disturbance / anti-</w:t>
             </w:r>
@@ -2697,16 +2657,16 @@
         </w:tc>
       </w:tr>
       <w:tr>
-        <w:trPr>
-          <w:tblCellSpacing w:w="15" w:type="dxa"/>
-        </w:trPr>
         <w:tc>
           <w:tcPr>
+            <w:cnfStyle w:val="001000000000" w:firstRow="0" w:lastRow="0" w:firstColumn="1" w:lastColumn="0" w:oddVBand="0" w:evenVBand="0" w:oddHBand="0" w:evenHBand="0" w:firstRowFirstColumn="0" w:firstRowLastColumn="0" w:lastRowFirstColumn="0" w:lastRowLastColumn="0"/>
             <w:tcW w:w="0" w:type="auto"/>
-            <w:vAlign w:val="center"/>
             <w:hideMark/>
           </w:tcPr>
           <w:p>
+            <w:pPr>
+              <w:jc w:val="left"/>
+            </w:pPr>
             <w:r>
               <w:t>Continuous torque</w:t>
             </w:r>
@@ -2715,10 +2675,13 @@
         <w:tc>
           <w:tcPr>
             <w:tcW w:w="0" w:type="auto"/>
-            <w:vAlign w:val="center"/>
             <w:hideMark/>
           </w:tcPr>
           <w:p>
+            <w:pPr>
+              <w:jc w:val="left"/>
+              <w:cnfStyle w:val="000000000000" w:firstRow="0" w:lastRow="0" w:firstColumn="0" w:lastColumn="0" w:oddVBand="0" w:evenVBand="0" w:oddHBand="0" w:evenHBand="0" w:firstRowFirstColumn="0" w:firstRowLastColumn="0" w:lastRowFirstColumn="0" w:lastRowLastColumn="0"/>
+            </w:pPr>
             <w:r>
               <w:t>Torque to maintain steady rotation against friction</w:t>
             </w:r>
@@ -2727,10 +2690,13 @@
         <w:tc>
           <w:tcPr>
             <w:tcW w:w="0" w:type="auto"/>
-            <w:vAlign w:val="center"/>
             <w:hideMark/>
           </w:tcPr>
           <w:p>
+            <w:pPr>
+              <w:jc w:val="left"/>
+              <w:cnfStyle w:val="000000000000" w:firstRow="0" w:lastRow="0" w:firstColumn="0" w:lastColumn="0" w:oddVBand="0" w:evenVBand="0" w:oddHBand="0" w:evenHBand="0" w:firstRowFirstColumn="0" w:firstRowLastColumn="0" w:lastRowFirstColumn="0" w:lastRowLastColumn="0"/>
+            </w:pPr>
             <w:r>
               <w:t>To be determined</w:t>
             </w:r>
@@ -2739,10 +2705,13 @@
         <w:tc>
           <w:tcPr>
             <w:tcW w:w="0" w:type="auto"/>
-            <w:vAlign w:val="center"/>
             <w:hideMark/>
           </w:tcPr>
           <w:p>
+            <w:pPr>
+              <w:jc w:val="left"/>
+              <w:cnfStyle w:val="000000000000" w:firstRow="0" w:lastRow="0" w:firstColumn="0" w:lastColumn="0" w:oddVBand="0" w:evenVBand="0" w:oddHBand="0" w:evenHBand="0" w:firstRowFirstColumn="0" w:firstRowLastColumn="0" w:lastRowFirstColumn="0" w:lastRowLastColumn="0"/>
+            </w:pPr>
             <w:r>
               <w:t>Thermal / sustained operation requirement</w:t>
             </w:r>
@@ -3205,16 +3174,11 @@
       </w:r>
     </w:p>
     <w:p>
-      <w:r>
-        <w:t>[</w:t>
-      </w:r>
-      <w:r>
-        <w:br/>
+      <w:pPr>
+        <w:jc w:val="left"/>
+      </w:pPr>
+      <w:r>
         <w:t>T_{disturbance} = 2700 \times r_{eff}</w:t>
-      </w:r>
-      <w:r>
-        <w:br/>
-        <w:t>]</w:t>
       </w:r>
     </w:p>
     <w:p>
@@ -4984,6 +4948,7 @@
         <w:rPr>
           <w:noProof/>
         </w:rPr>
+        <w:lastRenderedPageBreak/>
         <w:drawing>
           <wp:anchor distT="0" distB="0" distL="114300" distR="114300" simplePos="0" relativeHeight="251658240" behindDoc="0" locked="0" layoutInCell="1" allowOverlap="1" wp14:anchorId="3F98D1B0" wp14:editId="407AD445">
             <wp:simplePos x="0" y="0"/>
@@ -5092,25 +5057,7 @@
             <w:rPr>
               <w:rFonts w:ascii="Cambria Math" w:hAnsi="Cambria Math"/>
             </w:rPr>
-            <m:t>=</m:t>
-          </m:r>
-          <m:r>
-            <w:rPr>
-              <w:rFonts w:ascii="Cambria Math" w:hAnsi="Cambria Math"/>
-            </w:rPr>
-            <m:t>576919050.64</m:t>
-          </m:r>
-          <m:r>
-            <w:rPr>
-              <w:rFonts w:ascii="Cambria Math" w:hAnsi="Cambria Math"/>
-            </w:rPr>
-            <m:t xml:space="preserve"> </m:t>
-          </m:r>
-          <m:r>
-            <w:rPr>
-              <w:rFonts w:ascii="Cambria Math" w:hAnsi="Cambria Math"/>
-            </w:rPr>
-            <m:t>g⋅m</m:t>
+            <m:t>=576919050.64 g⋅m</m:t>
           </m:r>
           <m:sSup>
             <m:sSupPr>
@@ -5152,27 +5099,7 @@
               <w:rFonts w:ascii="Cambria Math" w:hAnsi="Cambria Math"/>
               <w:highlight w:val="yellow"/>
             </w:rPr>
-            <m:t>0.5</m:t>
-          </m:r>
-          <m:r>
-            <m:rPr>
-              <m:sty m:val="bi"/>
-            </m:rPr>
-            <w:rPr>
-              <w:rFonts w:ascii="Cambria Math" w:hAnsi="Cambria Math"/>
-              <w:highlight w:val="yellow"/>
-            </w:rPr>
-            <m:t>77</m:t>
-          </m:r>
-          <m:r>
-            <m:rPr>
-              <m:sty m:val="bi"/>
-            </m:rPr>
-            <w:rPr>
-              <w:rFonts w:ascii="Cambria Math" w:hAnsi="Cambria Math"/>
-              <w:highlight w:val="yellow"/>
-            </w:rPr>
-            <m:t xml:space="preserve"> kg⋅</m:t>
+            <m:t>0.577 kg⋅</m:t>
           </m:r>
           <m:sSup>
             <m:sSupPr>
@@ -5377,6 +5304,7 @@
           <w:id w:val="-374625482"/>
           <w:citation/>
         </w:sdtPr>
+        <w:sdtEndPr/>
         <w:sdtContent>
           <w:r>
             <w:fldChar w:fldCharType="begin"/>
@@ -5427,6 +5355,7 @@
           <w:id w:val="-1955933522"/>
           <w:citation/>
         </w:sdtPr>
+        <w:sdtEndPr/>
         <w:sdtContent>
           <w:r>
             <w:fldChar w:fldCharType="begin"/>
@@ -5466,6 +5395,7 @@
           <w:id w:val="-658612403"/>
           <w:citation/>
         </w:sdtPr>
+        <w:sdtEndPr/>
         <w:sdtContent>
           <w:r>
             <w:fldChar w:fldCharType="begin"/>
@@ -5508,6 +5438,7 @@
           <w:id w:val="-2013831519"/>
           <w:citation/>
         </w:sdtPr>
+        <w:sdtEndPr/>
         <w:sdtContent>
           <w:r>
             <w:fldChar w:fldCharType="begin"/>
@@ -11952,6 +11883,7 @@
   <w:style w:type="character" w:default="1" w:styleId="DefaultParagraphFont">
     <w:name w:val="Default Paragraph Font"/>
     <w:uiPriority w:val="1"/>
+    <w:semiHidden/>
     <w:unhideWhenUsed/>
   </w:style>
   <w:style w:type="table" w:default="1" w:styleId="TableNormal">
@@ -12383,6 +12315,308 @@
       <w:szCs w:val="24"/>
     </w:rPr>
   </w:style>
+  <w:style w:type="table" w:styleId="PlainTable5">
+    <w:name w:val="Plain Table 5"/>
+    <w:basedOn w:val="TableNormal"/>
+    <w:uiPriority w:val="45"/>
+    <w:rsid w:val="007F258A"/>
+    <w:pPr>
+      <w:spacing w:after="0" w:line="240" w:lineRule="auto"/>
+    </w:pPr>
+    <w:tblPr>
+      <w:tblStyleRowBandSize w:val="1"/>
+      <w:tblStyleColBandSize w:val="1"/>
+    </w:tblPr>
+    <w:tblStylePr w:type="firstRow">
+      <w:rPr>
+        <w:rFonts w:asciiTheme="majorHAnsi" w:eastAsiaTheme="majorEastAsia" w:hAnsiTheme="majorHAnsi" w:cstheme="majorBidi"/>
+        <w:i/>
+        <w:iCs/>
+        <w:sz w:val="26"/>
+      </w:rPr>
+      <w:tblPr/>
+      <w:tcPr>
+        <w:tcBorders>
+          <w:bottom w:val="single" w:sz="4" w:space="0" w:color="7F7F7F" w:themeColor="text1" w:themeTint="80"/>
+        </w:tcBorders>
+        <w:shd w:val="clear" w:color="auto" w:fill="FFFFFF" w:themeFill="background1"/>
+      </w:tcPr>
+    </w:tblStylePr>
+    <w:tblStylePr w:type="lastRow">
+      <w:rPr>
+        <w:rFonts w:asciiTheme="majorHAnsi" w:eastAsiaTheme="majorEastAsia" w:hAnsiTheme="majorHAnsi" w:cstheme="majorBidi"/>
+        <w:i/>
+        <w:iCs/>
+        <w:sz w:val="26"/>
+      </w:rPr>
+      <w:tblPr/>
+      <w:tcPr>
+        <w:tcBorders>
+          <w:top w:val="single" w:sz="4" w:space="0" w:color="7F7F7F" w:themeColor="text1" w:themeTint="80"/>
+        </w:tcBorders>
+        <w:shd w:val="clear" w:color="auto" w:fill="FFFFFF" w:themeFill="background1"/>
+      </w:tcPr>
+    </w:tblStylePr>
+    <w:tblStylePr w:type="firstCol">
+      <w:pPr>
+        <w:jc w:val="right"/>
+      </w:pPr>
+      <w:rPr>
+        <w:rFonts w:asciiTheme="majorHAnsi" w:eastAsiaTheme="majorEastAsia" w:hAnsiTheme="majorHAnsi" w:cstheme="majorBidi"/>
+        <w:i/>
+        <w:iCs/>
+        <w:sz w:val="26"/>
+      </w:rPr>
+      <w:tblPr/>
+      <w:tcPr>
+        <w:tcBorders>
+          <w:right w:val="single" w:sz="4" w:space="0" w:color="7F7F7F" w:themeColor="text1" w:themeTint="80"/>
+        </w:tcBorders>
+        <w:shd w:val="clear" w:color="auto" w:fill="FFFFFF" w:themeFill="background1"/>
+      </w:tcPr>
+    </w:tblStylePr>
+    <w:tblStylePr w:type="lastCol">
+      <w:rPr>
+        <w:rFonts w:asciiTheme="majorHAnsi" w:eastAsiaTheme="majorEastAsia" w:hAnsiTheme="majorHAnsi" w:cstheme="majorBidi"/>
+        <w:i/>
+        <w:iCs/>
+        <w:sz w:val="26"/>
+      </w:rPr>
+      <w:tblPr/>
+      <w:tcPr>
+        <w:tcBorders>
+          <w:left w:val="single" w:sz="4" w:space="0" w:color="7F7F7F" w:themeColor="text1" w:themeTint="80"/>
+        </w:tcBorders>
+        <w:shd w:val="clear" w:color="auto" w:fill="FFFFFF" w:themeFill="background1"/>
+      </w:tcPr>
+    </w:tblStylePr>
+    <w:tblStylePr w:type="band1Vert">
+      <w:tblPr/>
+      <w:tcPr>
+        <w:shd w:val="clear" w:color="auto" w:fill="F2F2F2" w:themeFill="background1" w:themeFillShade="F2"/>
+      </w:tcPr>
+    </w:tblStylePr>
+    <w:tblStylePr w:type="band1Horz">
+      <w:tblPr/>
+      <w:tcPr>
+        <w:shd w:val="clear" w:color="auto" w:fill="F2F2F2" w:themeFill="background1" w:themeFillShade="F2"/>
+      </w:tcPr>
+    </w:tblStylePr>
+    <w:tblStylePr w:type="neCell">
+      <w:tblPr/>
+      <w:tcPr>
+        <w:tcBorders>
+          <w:left w:val="nil"/>
+        </w:tcBorders>
+      </w:tcPr>
+    </w:tblStylePr>
+    <w:tblStylePr w:type="nwCell">
+      <w:tblPr/>
+      <w:tcPr>
+        <w:tcBorders>
+          <w:right w:val="nil"/>
+        </w:tcBorders>
+      </w:tcPr>
+    </w:tblStylePr>
+    <w:tblStylePr w:type="seCell">
+      <w:tblPr/>
+      <w:tcPr>
+        <w:tcBorders>
+          <w:left w:val="nil"/>
+        </w:tcBorders>
+      </w:tcPr>
+    </w:tblStylePr>
+    <w:tblStylePr w:type="swCell">
+      <w:tblPr/>
+      <w:tcPr>
+        <w:tcBorders>
+          <w:right w:val="nil"/>
+        </w:tcBorders>
+      </w:tcPr>
+    </w:tblStylePr>
+  </w:style>
+  <w:style w:type="table" w:styleId="GridTable4">
+    <w:name w:val="Grid Table 4"/>
+    <w:basedOn w:val="TableNormal"/>
+    <w:uiPriority w:val="49"/>
+    <w:rsid w:val="007F258A"/>
+    <w:pPr>
+      <w:spacing w:after="0" w:line="240" w:lineRule="auto"/>
+    </w:pPr>
+    <w:tblPr>
+      <w:tblStyleRowBandSize w:val="1"/>
+      <w:tblStyleColBandSize w:val="1"/>
+      <w:tblBorders>
+        <w:top w:val="single" w:sz="4" w:space="0" w:color="666666" w:themeColor="text1" w:themeTint="99"/>
+        <w:left w:val="single" w:sz="4" w:space="0" w:color="666666" w:themeColor="text1" w:themeTint="99"/>
+        <w:bottom w:val="single" w:sz="4" w:space="0" w:color="666666" w:themeColor="text1" w:themeTint="99"/>
+        <w:right w:val="single" w:sz="4" w:space="0" w:color="666666" w:themeColor="text1" w:themeTint="99"/>
+        <w:insideH w:val="single" w:sz="4" w:space="0" w:color="666666" w:themeColor="text1" w:themeTint="99"/>
+        <w:insideV w:val="single" w:sz="4" w:space="0" w:color="666666" w:themeColor="text1" w:themeTint="99"/>
+      </w:tblBorders>
+    </w:tblPr>
+    <w:tblStylePr w:type="firstRow">
+      <w:rPr>
+        <w:b/>
+        <w:bCs/>
+        <w:color w:val="FFFFFF" w:themeColor="background1"/>
+      </w:rPr>
+      <w:tblPr/>
+      <w:tcPr>
+        <w:tcBorders>
+          <w:top w:val="single" w:sz="4" w:space="0" w:color="000000" w:themeColor="text1"/>
+          <w:left w:val="single" w:sz="4" w:space="0" w:color="000000" w:themeColor="text1"/>
+          <w:bottom w:val="single" w:sz="4" w:space="0" w:color="000000" w:themeColor="text1"/>
+          <w:right w:val="single" w:sz="4" w:space="0" w:color="000000" w:themeColor="text1"/>
+          <w:insideH w:val="nil"/>
+          <w:insideV w:val="nil"/>
+        </w:tcBorders>
+        <w:shd w:val="clear" w:color="auto" w:fill="000000" w:themeFill="text1"/>
+      </w:tcPr>
+    </w:tblStylePr>
+    <w:tblStylePr w:type="lastRow">
+      <w:rPr>
+        <w:b/>
+        <w:bCs/>
+      </w:rPr>
+      <w:tblPr/>
+      <w:tcPr>
+        <w:tcBorders>
+          <w:top w:val="double" w:sz="4" w:space="0" w:color="000000" w:themeColor="text1"/>
+        </w:tcBorders>
+      </w:tcPr>
+    </w:tblStylePr>
+    <w:tblStylePr w:type="firstCol">
+      <w:rPr>
+        <w:b/>
+        <w:bCs/>
+      </w:rPr>
+    </w:tblStylePr>
+    <w:tblStylePr w:type="lastCol">
+      <w:rPr>
+        <w:b/>
+        <w:bCs/>
+      </w:rPr>
+    </w:tblStylePr>
+    <w:tblStylePr w:type="band1Vert">
+      <w:tblPr/>
+      <w:tcPr>
+        <w:shd w:val="clear" w:color="auto" w:fill="CCCCCC" w:themeFill="text1" w:themeFillTint="33"/>
+      </w:tcPr>
+    </w:tblStylePr>
+    <w:tblStylePr w:type="band1Horz">
+      <w:tblPr/>
+      <w:tcPr>
+        <w:shd w:val="clear" w:color="auto" w:fill="CCCCCC" w:themeFill="text1" w:themeFillTint="33"/>
+      </w:tcPr>
+    </w:tblStylePr>
+  </w:style>
+  <w:style w:type="table" w:styleId="GridTable5Dark">
+    <w:name w:val="Grid Table 5 Dark"/>
+    <w:basedOn w:val="TableNormal"/>
+    <w:uiPriority w:val="50"/>
+    <w:rsid w:val="007F258A"/>
+    <w:pPr>
+      <w:spacing w:after="0" w:line="240" w:lineRule="auto"/>
+    </w:pPr>
+    <w:tblPr>
+      <w:tblStyleRowBandSize w:val="1"/>
+      <w:tblStyleColBandSize w:val="1"/>
+      <w:tblBorders>
+        <w:top w:val="single" w:sz="4" w:space="0" w:color="FFFFFF" w:themeColor="background1"/>
+        <w:left w:val="single" w:sz="4" w:space="0" w:color="FFFFFF" w:themeColor="background1"/>
+        <w:bottom w:val="single" w:sz="4" w:space="0" w:color="FFFFFF" w:themeColor="background1"/>
+        <w:right w:val="single" w:sz="4" w:space="0" w:color="FFFFFF" w:themeColor="background1"/>
+        <w:insideH w:val="single" w:sz="4" w:space="0" w:color="FFFFFF" w:themeColor="background1"/>
+        <w:insideV w:val="single" w:sz="4" w:space="0" w:color="FFFFFF" w:themeColor="background1"/>
+      </w:tblBorders>
+    </w:tblPr>
+    <w:tcPr>
+      <w:shd w:val="clear" w:color="auto" w:fill="CCCCCC" w:themeFill="text1" w:themeFillTint="33"/>
+    </w:tcPr>
+    <w:tblStylePr w:type="firstRow">
+      <w:rPr>
+        <w:b/>
+        <w:bCs/>
+        <w:color w:val="FFFFFF" w:themeColor="background1"/>
+      </w:rPr>
+      <w:tblPr/>
+      <w:tcPr>
+        <w:tcBorders>
+          <w:top w:val="single" w:sz="4" w:space="0" w:color="FFFFFF" w:themeColor="background1"/>
+          <w:left w:val="single" w:sz="4" w:space="0" w:color="FFFFFF" w:themeColor="background1"/>
+          <w:right w:val="single" w:sz="4" w:space="0" w:color="FFFFFF" w:themeColor="background1"/>
+          <w:insideH w:val="nil"/>
+          <w:insideV w:val="nil"/>
+        </w:tcBorders>
+        <w:shd w:val="clear" w:color="auto" w:fill="000000" w:themeFill="text1"/>
+      </w:tcPr>
+    </w:tblStylePr>
+    <w:tblStylePr w:type="lastRow">
+      <w:rPr>
+        <w:b/>
+        <w:bCs/>
+        <w:color w:val="FFFFFF" w:themeColor="background1"/>
+      </w:rPr>
+      <w:tblPr/>
+      <w:tcPr>
+        <w:tcBorders>
+          <w:left w:val="single" w:sz="4" w:space="0" w:color="FFFFFF" w:themeColor="background1"/>
+          <w:bottom w:val="single" w:sz="4" w:space="0" w:color="FFFFFF" w:themeColor="background1"/>
+          <w:right w:val="single" w:sz="4" w:space="0" w:color="FFFFFF" w:themeColor="background1"/>
+          <w:insideH w:val="nil"/>
+          <w:insideV w:val="nil"/>
+        </w:tcBorders>
+        <w:shd w:val="clear" w:color="auto" w:fill="000000" w:themeFill="text1"/>
+      </w:tcPr>
+    </w:tblStylePr>
+    <w:tblStylePr w:type="firstCol">
+      <w:rPr>
+        <w:b/>
+        <w:bCs/>
+        <w:color w:val="FFFFFF" w:themeColor="background1"/>
+      </w:rPr>
+      <w:tblPr/>
+      <w:tcPr>
+        <w:tcBorders>
+          <w:top w:val="single" w:sz="4" w:space="0" w:color="FFFFFF" w:themeColor="background1"/>
+          <w:left w:val="single" w:sz="4" w:space="0" w:color="FFFFFF" w:themeColor="background1"/>
+          <w:bottom w:val="single" w:sz="4" w:space="0" w:color="FFFFFF" w:themeColor="background1"/>
+          <w:insideV w:val="nil"/>
+        </w:tcBorders>
+        <w:shd w:val="clear" w:color="auto" w:fill="000000" w:themeFill="text1"/>
+      </w:tcPr>
+    </w:tblStylePr>
+    <w:tblStylePr w:type="lastCol">
+      <w:rPr>
+        <w:b/>
+        <w:bCs/>
+        <w:color w:val="FFFFFF" w:themeColor="background1"/>
+      </w:rPr>
+      <w:tblPr/>
+      <w:tcPr>
+        <w:tcBorders>
+          <w:top w:val="single" w:sz="4" w:space="0" w:color="FFFFFF" w:themeColor="background1"/>
+          <w:bottom w:val="single" w:sz="4" w:space="0" w:color="FFFFFF" w:themeColor="background1"/>
+          <w:right w:val="single" w:sz="4" w:space="0" w:color="FFFFFF" w:themeColor="background1"/>
+          <w:insideV w:val="nil"/>
+        </w:tcBorders>
+        <w:shd w:val="clear" w:color="auto" w:fill="000000" w:themeFill="text1"/>
+      </w:tcPr>
+    </w:tblStylePr>
+    <w:tblStylePr w:type="band1Vert">
+      <w:tblPr/>
+      <w:tcPr>
+        <w:shd w:val="clear" w:color="auto" w:fill="999999" w:themeFill="text1" w:themeFillTint="66"/>
+      </w:tcPr>
+    </w:tblStylePr>
+    <w:tblStylePr w:type="band1Horz">
+      <w:tblPr/>
+      <w:tcPr>
+        <w:shd w:val="clear" w:color="auto" w:fill="999999" w:themeFill="text1" w:themeFillTint="66"/>
+      </w:tcPr>
+    </w:tblStylePr>
+  </w:style>
 </w:styles>
 </file>
 
@@ -12682,131 +12916,12 @@
 </file>
 
 <file path=customXml/item1.xml><?xml version="1.0" encoding="utf-8"?>
-<b:Sources xmlns:b="http://schemas.openxmlformats.org/officeDocument/2006/bibliography" xmlns="http://schemas.openxmlformats.org/officeDocument/2006/bibliography" SelectedStyle="\APASixthEditionOfficeOnline.xsl" StyleName="APA" Version="6">
-  <b:Source>
-    <b:Tag>Joh</b:Tag>
-    <b:SourceType>JournalArticle</b:SourceType>
-    <b:Guid>{3A828EBF-84FB-4EED-B645-F5D4FB216A1E}</b:Guid>
-    <b:Author>
-      <b:Author>
-        <b:NameList>
-          <b:Person>
-            <b:Last>Pierce</b:Last>
-            <b:First>John</b:First>
-          </b:Person>
-          <b:Person>
-            <b:Last>Reinbold</b:Last>
-            <b:First>Kirk</b:First>
-            <b:Middle>A</b:Middle>
-          </b:Person>
-          <b:Person>
-            <b:Last>Lyngard</b:Last>
-            <b:First>Barry</b:First>
-            <b:Middle>C</b:Middle>
-          </b:Person>
-          <b:Person>
-            <b:Last>Goldman</b:Last>
-            <b:First>Robert</b:First>
-            <b:Middle>J</b:Middle>
-          </b:Person>
-        </b:NameList>
-      </b:Author>
-    </b:Author>
-    <b:Title>Direct Measurement of Punch Force During Six Professional Boxing Matches</b:Title>
-    <b:JournalName>Journal of Quantitative Analysis in Sports</b:JournalName>
-    <b:Year>2007</b:Year>
-    <b:Month>February</b:Month>
-    <b:Publisher>ResearchGate</b:Publisher>
-    <b:Volume>2(2)</b:Volume>
-    <b:Issue>3-3</b:Issue>
-    <b:URL>https://www.researchgate.net/publication/4744109_Direct_Measurement_of_Punch_Force_During_Six_Professional_Boxing_Matches</b:URL>
-    <b:DOI>10.2202/1559-0410.1004</b:DOI>
-    <b:RefOrder>1</b:RefOrder>
-  </b:Source>
-  <b:Source>
-    <b:Tag>Box21</b:Tag>
-    <b:SourceType>InternetSite</b:SourceType>
-    <b:Guid>{8B5DAE1A-F681-4458-B195-F47BC5E88F56}</b:Guid>
-    <b:Title>The Science Behind The Punch</b:Title>
-    <b:Year>2021</b:Year>
-    <b:Author>
-      <b:Author>
-        <b:Corporate>Boxing Science</b:Corporate>
-      </b:Author>
-    </b:Author>
-    <b:InternetSiteTitle>Boxing Science Website</b:InternetSiteTitle>
-    <b:Month>November</b:Month>
-    <b:Day>18</b:Day>
-    <b:URL>https://boxingscience.co.uk/science-behind-punch/</b:URL>
-    <b:RefOrder>2</b:RefOrder>
-  </b:Source>
-  <b:Source>
-    <b:Tag>XuX25</b:Tag>
-    <b:SourceType>JournalArticle</b:SourceType>
-    <b:Guid>{51CBA48E-AE1B-44EF-87A4-E06ABCD81670}</b:Guid>
-    <b:Author>
-      <b:Author>
-        <b:NameList>
-          <b:Person>
-            <b:Last>Xu</b:Last>
-            <b:First>Xiaoyang</b:First>
-          </b:Person>
-          <b:Person>
-            <b:Last>Sun</b:Last>
-            <b:First>Yuke</b:First>
-          </b:Person>
-          <b:Person>
-            <b:Last>Zhu</b:Last>
-            <b:First>Dong</b:First>
-          </b:Person>
-        </b:NameList>
-      </b:Author>
-    </b:Author>
-    <b:Title>Analysis of the impact force and key technique of backward straight punch in different combat sports</b:Title>
-    <b:JournalName>Scientific Reports</b:JournalName>
-    <b:Year>2025</b:Year>
-    <b:Month>March</b:Month>
-    <b:Day>31</b:Day>
-    <b:Volume>15</b:Volume>
-    <b:Issue>10958</b:Issue>
-    <b:URL>https://www.nature.com/articles/s41598-025-96264-4#citeas</b:URL>
-    <b:DOI>https://doi.org/10.1038/s41598-025-96264-4</b:DOI>
-    <b:RefOrder>3</b:RefOrder>
-  </b:Source>
-  <b:Source>
-    <b:Tag>TWa05</b:Tag>
-    <b:SourceType>JournalArticle</b:SourceType>
-    <b:Guid>{1C61D93B-EE1D-4AE8-BE29-47BEBB4F315A}</b:Guid>
-    <b:Title>Biomechanics of the head for Olympic boxer punches to the face</b:Title>
-    <b:Year>2005</b:Year>
-    <b:URL>https://pmc.ncbi.nlm.nih.gov/articles/PMC1725037/?utm_source=chatgpt.com</b:URL>
-    <b:DOI>10.1136/bjsm.2004.014126</b:DOI>
-    <b:Author>
-      <b:Author>
-        <b:NameList>
-          <b:Person>
-            <b:Last>Walilko</b:Last>
-            <b:First>T</b:First>
-          </b:Person>
-          <b:Person>
-            <b:Last>Viano</b:Last>
-            <b:First>D</b:First>
-          </b:Person>
-          <b:Person>
-            <b:Last>Bir</b:Last>
-            <b:First>C</b:First>
-          </b:Person>
-        </b:NameList>
-      </b:Author>
-    </b:Author>
-    <b:JournalName>Br J Sports Med</b:JournalName>
-    <b:Pages>710–719</b:Pages>
-    <b:Publisher>NLM</b:Publisher>
-    <b:Volume>39</b:Volume>
-    <b:Issue>10</b:Issue>
-    <b:RefOrder>4</b:RefOrder>
-  </b:Source>
-</b:Sources>
+<?mso-contentType ?>
+<FormTemplates xmlns="http://schemas.microsoft.com/sharepoint/v3/contenttype/forms">
+  <Display>DocumentLibraryForm</Display>
+  <Edit>DocumentLibraryForm</Edit>
+  <New>DocumentLibraryForm</New>
+</FormTemplates>
 </file>
 
 <file path=customXml/item2.xml><?xml version="1.0" encoding="utf-8"?>
@@ -13011,12 +13126,131 @@
 </file>
 
 <file path=customXml/item3.xml><?xml version="1.0" encoding="utf-8"?>
-<?mso-contentType ?>
-<FormTemplates xmlns="http://schemas.microsoft.com/sharepoint/v3/contenttype/forms">
-  <Display>DocumentLibraryForm</Display>
-  <Edit>DocumentLibraryForm</Edit>
-  <New>DocumentLibraryForm</New>
-</FormTemplates>
+<b:Sources xmlns:b="http://schemas.openxmlformats.org/officeDocument/2006/bibliography" xmlns="http://schemas.openxmlformats.org/officeDocument/2006/bibliography" SelectedStyle="\APASixthEditionOfficeOnline.xsl" StyleName="APA" Version="6">
+  <b:Source>
+    <b:Tag>Joh</b:Tag>
+    <b:SourceType>JournalArticle</b:SourceType>
+    <b:Guid>{3A828EBF-84FB-4EED-B645-F5D4FB216A1E}</b:Guid>
+    <b:Author>
+      <b:Author>
+        <b:NameList>
+          <b:Person>
+            <b:Last>Pierce</b:Last>
+            <b:First>John</b:First>
+          </b:Person>
+          <b:Person>
+            <b:Last>Reinbold</b:Last>
+            <b:First>Kirk</b:First>
+            <b:Middle>A</b:Middle>
+          </b:Person>
+          <b:Person>
+            <b:Last>Lyngard</b:Last>
+            <b:First>Barry</b:First>
+            <b:Middle>C</b:Middle>
+          </b:Person>
+          <b:Person>
+            <b:Last>Goldman</b:Last>
+            <b:First>Robert</b:First>
+            <b:Middle>J</b:Middle>
+          </b:Person>
+        </b:NameList>
+      </b:Author>
+    </b:Author>
+    <b:Title>Direct Measurement of Punch Force During Six Professional Boxing Matches</b:Title>
+    <b:JournalName>Journal of Quantitative Analysis in Sports</b:JournalName>
+    <b:Year>2007</b:Year>
+    <b:Month>February</b:Month>
+    <b:Publisher>ResearchGate</b:Publisher>
+    <b:Volume>2(2)</b:Volume>
+    <b:Issue>3-3</b:Issue>
+    <b:URL>https://www.researchgate.net/publication/4744109_Direct_Measurement_of_Punch_Force_During_Six_Professional_Boxing_Matches</b:URL>
+    <b:DOI>10.2202/1559-0410.1004</b:DOI>
+    <b:RefOrder>1</b:RefOrder>
+  </b:Source>
+  <b:Source>
+    <b:Tag>Box21</b:Tag>
+    <b:SourceType>InternetSite</b:SourceType>
+    <b:Guid>{8B5DAE1A-F681-4458-B195-F47BC5E88F56}</b:Guid>
+    <b:Title>The Science Behind The Punch</b:Title>
+    <b:Year>2021</b:Year>
+    <b:Author>
+      <b:Author>
+        <b:Corporate>Boxing Science</b:Corporate>
+      </b:Author>
+    </b:Author>
+    <b:InternetSiteTitle>Boxing Science Website</b:InternetSiteTitle>
+    <b:Month>November</b:Month>
+    <b:Day>18</b:Day>
+    <b:URL>https://boxingscience.co.uk/science-behind-punch/</b:URL>
+    <b:RefOrder>2</b:RefOrder>
+  </b:Source>
+  <b:Source>
+    <b:Tag>XuX25</b:Tag>
+    <b:SourceType>JournalArticle</b:SourceType>
+    <b:Guid>{51CBA48E-AE1B-44EF-87A4-E06ABCD81670}</b:Guid>
+    <b:Author>
+      <b:Author>
+        <b:NameList>
+          <b:Person>
+            <b:Last>Xu</b:Last>
+            <b:First>Xiaoyang</b:First>
+          </b:Person>
+          <b:Person>
+            <b:Last>Sun</b:Last>
+            <b:First>Yuke</b:First>
+          </b:Person>
+          <b:Person>
+            <b:Last>Zhu</b:Last>
+            <b:First>Dong</b:First>
+          </b:Person>
+        </b:NameList>
+      </b:Author>
+    </b:Author>
+    <b:Title>Analysis of the impact force and key technique of backward straight punch in different combat sports</b:Title>
+    <b:JournalName>Scientific Reports</b:JournalName>
+    <b:Year>2025</b:Year>
+    <b:Month>March</b:Month>
+    <b:Day>31</b:Day>
+    <b:Volume>15</b:Volume>
+    <b:Issue>10958</b:Issue>
+    <b:URL>https://www.nature.com/articles/s41598-025-96264-4#citeas</b:URL>
+    <b:DOI>https://doi.org/10.1038/s41598-025-96264-4</b:DOI>
+    <b:RefOrder>3</b:RefOrder>
+  </b:Source>
+  <b:Source>
+    <b:Tag>TWa05</b:Tag>
+    <b:SourceType>JournalArticle</b:SourceType>
+    <b:Guid>{1C61D93B-EE1D-4AE8-BE29-47BEBB4F315A}</b:Guid>
+    <b:Title>Biomechanics of the head for Olympic boxer punches to the face</b:Title>
+    <b:Year>2005</b:Year>
+    <b:URL>https://pmc.ncbi.nlm.nih.gov/articles/PMC1725037/?utm_source=chatgpt.com</b:URL>
+    <b:DOI>10.1136/bjsm.2004.014126</b:DOI>
+    <b:Author>
+      <b:Author>
+        <b:NameList>
+          <b:Person>
+            <b:Last>Walilko</b:Last>
+            <b:First>T</b:First>
+          </b:Person>
+          <b:Person>
+            <b:Last>Viano</b:Last>
+            <b:First>D</b:First>
+          </b:Person>
+          <b:Person>
+            <b:Last>Bir</b:Last>
+            <b:First>C</b:First>
+          </b:Person>
+        </b:NameList>
+      </b:Author>
+    </b:Author>
+    <b:JournalName>Br J Sports Med</b:JournalName>
+    <b:Pages>710–719</b:Pages>
+    <b:Publisher>NLM</b:Publisher>
+    <b:Volume>39</b:Volume>
+    <b:Issue>10</b:Issue>
+    <b:RefOrder>4</b:RefOrder>
+  </b:Source>
+</b:Sources>
 </file>
 
 <file path=customXml/item4.xml><?xml version="1.0" encoding="utf-8"?>
@@ -13031,9 +13265,9 @@
 </file>
 
 <file path=customXml/itemProps1.xml><?xml version="1.0" encoding="utf-8"?>
-<ds:datastoreItem xmlns:ds="http://schemas.openxmlformats.org/officeDocument/2006/customXml" ds:itemID="{4FD3D31A-BE07-4EB7-A9EE-1CD3717D353E}">
+<ds:datastoreItem xmlns:ds="http://schemas.openxmlformats.org/officeDocument/2006/customXml" ds:itemID="{265B4AD9-B3C9-4736-887A-C58FD15590FC}">
   <ds:schemaRefs>
-    <ds:schemaRef ds:uri="http://schemas.openxmlformats.org/officeDocument/2006/bibliography"/>
+    <ds:schemaRef ds:uri="http://schemas.microsoft.com/sharepoint/v3/contenttype/forms"/>
   </ds:schemaRefs>
 </ds:datastoreItem>
 </file>
@@ -13058,9 +13292,9 @@
 </file>
 
 <file path=customXml/itemProps3.xml><?xml version="1.0" encoding="utf-8"?>
-<ds:datastoreItem xmlns:ds="http://schemas.openxmlformats.org/officeDocument/2006/customXml" ds:itemID="{265B4AD9-B3C9-4736-887A-C58FD15590FC}">
+<ds:datastoreItem xmlns:ds="http://schemas.openxmlformats.org/officeDocument/2006/customXml" ds:itemID="{4FD3D31A-BE07-4EB7-A9EE-1CD3717D353E}">
   <ds:schemaRefs>
-    <ds:schemaRef ds:uri="http://schemas.microsoft.com/sharepoint/v3/contenttype/forms"/>
+    <ds:schemaRef ds:uri="http://schemas.openxmlformats.org/officeDocument/2006/bibliography"/>
   </ds:schemaRefs>
 </ds:datastoreItem>
 </file>

</xml_diff>